<commit_message>
Fill entire Week 3 cover with pale blue background
</commit_message>
<xml_diff>
--- a/weeks/week03/Week3_Statistical_Analysis_Hypothesis_Testing.docx
+++ b/weeks/week03/Week3_Statistical_Analysis_Hypothesis_Testing.docx
@@ -7158,7 +7158,50 @@
 
 <file path=word/header2.xml><?xml version="1.0" encoding="utf-8"?>
 <w:hdr xmlns:m="http://schemas.openxmlformats.org/officeDocument/2006/math" xmlns:mc="http://schemas.openxmlformats.org/markup-compatibility/2006" xmlns:mo="http://schemas.microsoft.com/office/mac/office/2008/main" xmlns:mv="urn:schemas-microsoft-com:mac:vml" xmlns:o="urn:schemas-microsoft-com:office:office" xmlns:r="http://schemas.openxmlformats.org/officeDocument/2006/relationships" xmlns:v="urn:schemas-microsoft-com:vml" xmlns:w10="urn:schemas-microsoft-com:office:word" xmlns:w14="http://schemas.microsoft.com/office/word/2010/wordml" xmlns:w="http://schemas.openxmlformats.org/wordprocessingml/2006/main" xmlns:wne="http://schemas.microsoft.com/office/word/2006/wordml" xmlns:wp14="http://schemas.microsoft.com/office/word/2010/wordprocessingDrawing" xmlns:wp="http://schemas.openxmlformats.org/drawingml/2006/wordprocessingDrawing" xmlns:wpc="http://schemas.microsoft.com/office/word/2010/wordprocessingCanvas" xmlns:wpg="http://schemas.microsoft.com/office/word/2010/wordprocessingGroup" xmlns:wpi="http://schemas.microsoft.com/office/word/2010/wordprocessingInk" xmlns:wps="http://schemas.microsoft.com/office/word/2010/wordprocessingShape" mc:Ignorable="w14 wp14">
-  <w:p/>
+  <w:p>
+    <w:r>
+      <w:drawing>
+        <wp:anchor distT="0" distB="0" distL="0" distR="0" simplePos="0" relativeHeight="0" behindDoc="1" locked="0" layoutInCell="0" allowOverlap="1">
+          <wp:simplePos x="0" y="0"/>
+          <wp:positionH relativeFrom="page">
+            <wp:posOffset>0</wp:posOffset>
+          </wp:positionH>
+          <wp:positionV relativeFrom="page">
+            <wp:posOffset>0</wp:posOffset>
+          </wp:positionV>
+          <wp:extent cx="7560310" cy="10692130"/>
+          <wp:wrapNone/>
+          <wp:docPr id="1" name="Picture 1"/>
+          <wp:cNvGraphicFramePr xmlns:a="http://schemas.openxmlformats.org/drawingml/2006/main">
+            <a:graphicFrameLocks noChangeAspect="1"/>
+          </wp:cNvGraphicFramePr>
+          <a:graphic xmlns:a="http://schemas.openxmlformats.org/drawingml/2006/main" xmlns:pic="http://schemas.openxmlformats.org/drawingml/2006/picture">
+            <a:graphicData uri="http://schemas.openxmlformats.org/drawingml/2006/picture">
+              <pic:pic>
+                <pic:nvPicPr>
+                  <pic:cNvPr id="0" name="cover_background.png"/>
+                  <pic:cNvPicPr/>
+                </pic:nvPicPr>
+                <pic:blipFill>
+                  <a:blip r:embed="rId1"/>
+                  <a:stretch>
+                    <a:fillRect/>
+                  </a:stretch>
+                </pic:blipFill>
+                <pic:spPr>
+                  <a:xfrm>
+                    <a:off x="0" y="0"/>
+                    <a:ext cx="7560310" cy="10692130"/>
+                  </a:xfrm>
+                  <a:prstGeom prst="rect"/>
+                </pic:spPr>
+              </pic:pic>
+            </a:graphicData>
+          </a:graphic>
+        </wp:anchor>
+      </w:drawing>
+    </w:r>
+  </w:p>
 </w:hdr>
 </file>
 

</xml_diff>